<commit_message>
fix(docs): reformat bonafide certificate to match official university template
</commit_message>
<xml_diff>
--- a/PA6_PA66_Tribology_AI_Seventh_Sem_Report.docx
+++ b/PA6_PA66_Tribology_AI_Seventh_Sem_Report.docx
@@ -166,11 +166,52 @@
     </w:p>
     <w:p>
       <w:pPr>
-        <w:spacing w:before="360" w:after="360"/>
+        <w:spacing w:before="0" w:after="400"/>
+        <w:jc w:val="center"/>
+      </w:pPr>
+      <w:r>
+        <w:drawing>
+          <wp:inline xmlns:a="http://schemas.openxmlformats.org/drawingml/2006/main" xmlns:pic="http://schemas.openxmlformats.org/drawingml/2006/picture">
+            <wp:extent cx="3474720" cy="730400"/>
+            <wp:docPr id="2" name="Picture 2"/>
+            <wp:cNvGraphicFramePr>
+              <a:graphicFrameLocks noChangeAspect="1"/>
+            </wp:cNvGraphicFramePr>
+            <a:graphic>
+              <a:graphicData uri="http://schemas.openxmlformats.org/drawingml/2006/picture">
+                <pic:pic>
+                  <pic:nvPicPr>
+                    <pic:cNvPr id="0" name="image2.jpeg"/>
+                    <pic:cNvPicPr/>
+                  </pic:nvPicPr>
+                  <pic:blipFill>
+                    <a:blip r:embed="rId12"/>
+                    <a:stretch>
+                      <a:fillRect/>
+                    </a:stretch>
+                  </pic:blipFill>
+                  <pic:spPr>
+                    <a:xfrm>
+                      <a:off x="0" y="0"/>
+                      <a:ext cx="3474720" cy="730400"/>
+                    </a:xfrm>
+                    <a:prstGeom prst="rect"/>
+                  </pic:spPr>
+                </pic:pic>
+              </a:graphicData>
+            </a:graphic>
+          </wp:inline>
+        </w:drawing>
+      </w:r>
+    </w:p>
+    <w:p>
+      <w:pPr>
+        <w:spacing w:before="0" w:after="480"/>
         <w:jc w:val="center"/>
       </w:pPr>
       <w:r>
         <w:rPr>
+          <w:rFonts w:ascii="Times New Roman" w:hAnsi="Times New Roman"/>
           <w:b/>
           <w:sz w:val="32"/>
         </w:rPr>
@@ -179,72 +220,233 @@
     </w:p>
     <w:p>
       <w:pPr>
-        <w:spacing w:line="360" w:lineRule="auto" w:after="120"/>
+        <w:spacing w:before="0" w:after="720" w:line="300" w:lineRule="auto"/>
         <w:jc w:val="both"/>
       </w:pPr>
       <w:r>
         <w:rPr>
           <w:rFonts w:ascii="Times New Roman" w:hAnsi="Times New Roman"/>
-          <w:sz w:val="27"/>
+          <w:sz w:val="24"/>
         </w:rPr>
-        <w:t>This is to certify that this project report entitled "PHYSICS-INFORMED MACHINE LEARNING FRAMEWORK FOR MULTI-FILLER POLYAMIDE (PA6 / PA66) COMPOSITE TRIBOLOGY: MODELING, EMPIRICAL VALIDATION, AND INTERACTIVE VIRTUAL TRIBOMETER" is the bonafide work of "Mr. HARI SREERAM R (Reg. No. CH.SC.U4CSE23019)" and "Mr. M A SAI ADITHYAA (Reg. No. CH.SC.U4CSE23029)" who carried out the research project work under our supervision in partial fulfilment for the award of the degree of Bachelor of Technology in Computer Science and Engineering at Amrita School of Computing, Amrita Vishwa Vidyapeetham, Chennai.</w:t>
+        <w:t xml:space="preserve">This is to certify that this project report entitled </w:t>
       </w:r>
-    </w:p>
-    <w:p>
-      <w:pPr>
-        <w:spacing w:before="720" w:line="276" w:lineRule="auto"/>
-      </w:pPr>
       <w:r>
         <w:rPr>
-          <w:b/>
-          <w:sz w:val="23"/>
-        </w:rPr>
-        <w:t>SIGNATURE                                                                SIGNATURE</w:t>
-        <w:br/>
-        <w:br/>
-        <w:br/>
-        <w:br/>
-        <w:t>Dr. S. BHAGAVATHI PRIYA                                     Dr. SHUBRAJIT BHAUMIK</w:t>
-        <w:br/>
-        <w:t>CHAIRPERSON                                                          SUPERVISOR</w:t>
-        <w:br/>
-        <w:t>Associate Professor, Dept. of CSE                         Associate Professor, Dept. of Mechanical Eng.</w:t>
-        <w:br/>
-        <w:t>Amrita School of Computing                                    Amrita School of Engineering</w:t>
-        <w:br/>
-        <w:t>Chennai.                                                                    Chennai.</w:t>
-        <w:br/>
-        <w:br/>
-        <w:br/>
-        <w:br/>
-        <w:t>SIGNATURE                                                                SIGNATURE</w:t>
-        <w:br/>
-        <w:br/>
-        <w:br/>
-        <w:br/>
-        <w:t>Dr. SANGAPU SREENIVASA CHAKRAVARTHI   Dr. J. UMAMAGESWARAN</w:t>
-        <w:br/>
-        <w:t>CO-SUPERVISOR                                                       PROJECT COORDINATOR</w:t>
-        <w:br/>
-        <w:t>Assistant Professor (Sr. Gr.), Dept. of CSE            Associate Professor, Dept. of CSE</w:t>
-        <w:br/>
-        <w:t>Amrita School of Computing                                    Amrita School of Computing</w:t>
-        <w:br/>
-        <w:t>Chennai.                                                                    Chennai.</w:t>
-      </w:r>
-    </w:p>
-    <w:p>
-      <w:pPr>
-        <w:spacing w:before="600"/>
-      </w:pPr>
-      <w:r>
-        <w:rPr>
+          <w:rFonts w:ascii="Times New Roman" w:hAnsi="Times New Roman"/>
           <w:b/>
           <w:sz w:val="24"/>
         </w:rPr>
-        <w:t>INTERNAL EXAMINER                                                EXTERNAL EXAMINER</w:t>
+        <w:t>“PHYSICS-INFORMED MACHINE LEARNING FRAMEWORK FOR MULTI-FILLER POLYAMIDE (PA6 / PA66) COMPOSITE TRIBOLOGY: MODELING, EMPIRICAL VALIDATION, AND INTERACTIVE VIRTUAL TRIBOMETER”</w:t>
+      </w:r>
+      <w:r>
+        <w:rPr>
+          <w:rFonts w:ascii="Times New Roman" w:hAnsi="Times New Roman"/>
+          <w:sz w:val="24"/>
+        </w:rPr>
+        <w:t xml:space="preserve"> is the bonafide work of </w:t>
+      </w:r>
+      <w:r>
+        <w:rPr>
+          <w:rFonts w:ascii="Times New Roman" w:hAnsi="Times New Roman"/>
+          <w:b/>
+          <w:sz w:val="24"/>
+        </w:rPr>
+        <w:t>“HARI SREERAM R (CH.SC.U4CSE23019)”</w:t>
+      </w:r>
+      <w:r>
+        <w:rPr>
+          <w:rFonts w:ascii="Times New Roman" w:hAnsi="Times New Roman"/>
+          <w:sz w:val="24"/>
+        </w:rPr>
+        <w:t xml:space="preserve"> and </w:t>
+      </w:r>
+      <w:r>
+        <w:rPr>
+          <w:rFonts w:ascii="Times New Roman" w:hAnsi="Times New Roman"/>
+          <w:b/>
+          <w:sz w:val="24"/>
+        </w:rPr>
+        <w:t>“M A SAI ADITHYAA (CH.SC.U4CSE23029)”</w:t>
+      </w:r>
+      <w:r>
+        <w:rPr>
+          <w:rFonts w:ascii="Times New Roman" w:hAnsi="Times New Roman"/>
+          <w:sz w:val="24"/>
+        </w:rPr>
+        <w:t xml:space="preserve"> who carried out the project work under my supervision.</w:t>
       </w:r>
     </w:p>
+    <w:tbl>
+      <w:tblPr>
+        <w:tblW w:type="auto" w:w="0"/>
+        <w:tblLook w:firstColumn="1" w:firstRow="1" w:lastColumn="0" w:lastRow="0" w:noHBand="0" w:noVBand="1" w:val="04A0"/>
+        <w:tblBorders>
+          <w:top w:val="none"/>
+          <w:left w:val="none"/>
+          <w:bottom w:val="none"/>
+          <w:right w:val="none"/>
+          <w:insideH w:val="none"/>
+          <w:insideV w:val="none"/>
+        </w:tblBorders>
+        <w:tblCellMar>
+          <w:top w:w="0" w:type="dxa"/>
+          <w:left w:w="0" w:type="dxa"/>
+          <w:bottom w:w="0" w:type="dxa"/>
+          <w:right w:w="0" w:type="dxa"/>
+        </w:tblCellMar>
+      </w:tblPr>
+      <w:tblGrid>
+        <w:gridCol w:w="4860"/>
+        <w:gridCol w:w="4860"/>
+      </w:tblGrid>
+      <w:tr>
+        <w:tc>
+          <w:tcPr>
+            <w:tcW w:type="dxa" w:w="5472"/>
+          </w:tcPr>
+          <w:p>
+            <w:pPr>
+              <w:spacing w:before="0" w:after="720" w:line="276" w:lineRule="auto"/>
+            </w:pPr>
+            <w:r>
+              <w:rPr>
+                <w:rFonts w:ascii="Times New Roman" w:hAnsi="Times New Roman"/>
+                <w:b/>
+                <w:sz w:val="24"/>
+              </w:rPr>
+              <w:t>SIGNATURE</w:t>
+            </w:r>
+          </w:p>
+          <w:p>
+            <w:pPr>
+              <w:spacing w:before="0" w:after="0" w:line="276" w:lineRule="auto"/>
+            </w:pPr>
+            <w:r>
+              <w:rPr>
+                <w:rFonts w:ascii="Times New Roman" w:hAnsi="Times New Roman"/>
+                <w:b/>
+                <w:sz w:val="24"/>
+              </w:rPr>
+              <w:t>Dr. S. Bhagavathi Priya</w:t>
+              <w:br/>
+              <w:t>CHAIRPERSON</w:t>
+              <w:br/>
+              <w:t>Department of CSE</w:t>
+              <w:br/>
+              <w:t>Amrita School of Computing</w:t>
+              <w:br/>
+              <w:t>Chennai.</w:t>
+            </w:r>
+          </w:p>
+        </w:tc>
+        <w:tc>
+          <w:tcPr>
+            <w:tcW w:type="dxa" w:w="3888"/>
+          </w:tcPr>
+          <w:p>
+            <w:pPr>
+              <w:spacing w:before="0" w:after="720" w:line="276" w:lineRule="auto"/>
+            </w:pPr>
+            <w:r>
+              <w:rPr>
+                <w:rFonts w:ascii="Times New Roman" w:hAnsi="Times New Roman"/>
+                <w:b/>
+                <w:sz w:val="24"/>
+              </w:rPr>
+              <w:t>SIGNATURE</w:t>
+            </w:r>
+          </w:p>
+          <w:p>
+            <w:pPr>
+              <w:spacing w:before="0" w:after="0" w:line="276" w:lineRule="auto"/>
+            </w:pPr>
+            <w:r>
+              <w:rPr>
+                <w:rFonts w:ascii="Times New Roman" w:hAnsi="Times New Roman"/>
+                <w:b/>
+                <w:sz w:val="24"/>
+              </w:rPr>
+              <w:t>Dr. Sangapu Sreenivasa Chakravarthi</w:t>
+              <w:br/>
+              <w:t>SUPERVISOR</w:t>
+              <w:br/>
+              <w:t>Department of CSE</w:t>
+              <w:br/>
+              <w:t>Amrita School of Computing</w:t>
+              <w:br/>
+              <w:t>Chennai.</w:t>
+            </w:r>
+          </w:p>
+        </w:tc>
+      </w:tr>
+    </w:tbl>
+    <w:p>
+      <w:pPr>
+        <w:spacing w:before="960" w:after="0"/>
+      </w:pPr>
+    </w:p>
+    <w:tbl>
+      <w:tblPr>
+        <w:tblW w:type="auto" w:w="0"/>
+        <w:tblLook w:firstColumn="1" w:firstRow="1" w:lastColumn="0" w:lastRow="0" w:noHBand="0" w:noVBand="1" w:val="04A0"/>
+        <w:tblBorders>
+          <w:top w:val="none"/>
+          <w:left w:val="none"/>
+          <w:bottom w:val="none"/>
+          <w:right w:val="none"/>
+          <w:insideH w:val="none"/>
+          <w:insideV w:val="none"/>
+        </w:tblBorders>
+        <w:tblCellMar>
+          <w:top w:w="0" w:type="dxa"/>
+          <w:left w:w="0" w:type="dxa"/>
+          <w:bottom w:w="0" w:type="dxa"/>
+          <w:right w:w="0" w:type="dxa"/>
+        </w:tblCellMar>
+      </w:tblPr>
+      <w:tblGrid>
+        <w:gridCol w:w="4860"/>
+        <w:gridCol w:w="4860"/>
+      </w:tblGrid>
+      <w:tr>
+        <w:tc>
+          <w:tcPr>
+            <w:tcW w:type="dxa" w:w="5472"/>
+          </w:tcPr>
+          <w:p>
+            <w:pPr>
+              <w:spacing w:before="0" w:after="0"/>
+            </w:pPr>
+            <w:r>
+              <w:rPr>
+                <w:rFonts w:ascii="Times New Roman" w:hAnsi="Times New Roman"/>
+                <w:b/>
+                <w:sz w:val="24"/>
+              </w:rPr>
+              <w:t>INTERNAL EXAMINER</w:t>
+            </w:r>
+          </w:p>
+        </w:tc>
+        <w:tc>
+          <w:tcPr>
+            <w:tcW w:type="dxa" w:w="3888"/>
+          </w:tcPr>
+          <w:p>
+            <w:pPr>
+              <w:spacing w:before="0" w:after="0"/>
+            </w:pPr>
+            <w:r>
+              <w:rPr>
+                <w:rFonts w:ascii="Times New Roman" w:hAnsi="Times New Roman"/>
+                <w:b/>
+                <w:sz w:val="24"/>
+              </w:rPr>
+              <w:t>EXTERNAL EXAMINER</w:t>
+            </w:r>
+          </w:p>
+        </w:tc>
+      </w:tr>
+    </w:tbl>
     <w:p>
       <w:r>
         <w:br w:type="page"/>
@@ -8712,7 +8914,7 @@
         <w:drawing>
           <wp:inline xmlns:a="http://schemas.openxmlformats.org/drawingml/2006/main" xmlns:pic="http://schemas.openxmlformats.org/drawingml/2006/picture">
             <wp:extent cx="5303520" cy="3014231"/>
-            <wp:docPr id="2" name="Picture 2"/>
+            <wp:docPr id="3" name="Picture 3"/>
             <wp:cNvGraphicFramePr>
               <a:graphicFrameLocks noChangeAspect="1"/>
             </wp:cNvGraphicFramePr>
@@ -8724,7 +8926,7 @@
                     <pic:cNvPicPr/>
                   </pic:nvPicPr>
                   <pic:blipFill>
-                    <a:blip r:embed="rId13"/>
+                    <a:blip r:embed="rId14"/>
                     <a:stretch>
                       <a:fillRect/>
                     </a:stretch>
@@ -8779,7 +8981,7 @@
         <w:drawing>
           <wp:inline xmlns:a="http://schemas.openxmlformats.org/drawingml/2006/main" xmlns:pic="http://schemas.openxmlformats.org/drawingml/2006/picture">
             <wp:extent cx="5669280" cy="3269585"/>
-            <wp:docPr id="3" name="Picture 3"/>
+            <wp:docPr id="4" name="Picture 4"/>
             <wp:cNvGraphicFramePr>
               <a:graphicFrameLocks noChangeAspect="1"/>
             </wp:cNvGraphicFramePr>
@@ -8791,7 +8993,7 @@
                     <pic:cNvPicPr/>
                   </pic:nvPicPr>
                   <pic:blipFill>
-                    <a:blip r:embed="rId14"/>
+                    <a:blip r:embed="rId15"/>
                     <a:stretch>
                       <a:fillRect/>
                     </a:stretch>
@@ -9015,7 +9217,7 @@
         <w:drawing>
           <wp:inline xmlns:a="http://schemas.openxmlformats.org/drawingml/2006/main" xmlns:pic="http://schemas.openxmlformats.org/drawingml/2006/picture">
             <wp:extent cx="5669280" cy="4224877"/>
-            <wp:docPr id="4" name="Picture 4"/>
+            <wp:docPr id="5" name="Picture 5"/>
             <wp:cNvGraphicFramePr>
               <a:graphicFrameLocks noChangeAspect="1"/>
             </wp:cNvGraphicFramePr>
@@ -9027,7 +9229,7 @@
                     <pic:cNvPicPr/>
                   </pic:nvPicPr>
                   <pic:blipFill>
-                    <a:blip r:embed="rId15"/>
+                    <a:blip r:embed="rId16"/>
                     <a:stretch>
                       <a:fillRect/>
                     </a:stretch>
@@ -12580,7 +12782,7 @@
         <w:drawing>
           <wp:inline xmlns:a="http://schemas.openxmlformats.org/drawingml/2006/main" xmlns:pic="http://schemas.openxmlformats.org/drawingml/2006/picture">
             <wp:extent cx="5486400" cy="3080044"/>
-            <wp:docPr id="5" name="Picture 5"/>
+            <wp:docPr id="6" name="Picture 6"/>
             <wp:cNvGraphicFramePr>
               <a:graphicFrameLocks noChangeAspect="1"/>
             </wp:cNvGraphicFramePr>
@@ -12592,7 +12794,7 @@
                     <pic:cNvPicPr/>
                   </pic:nvPicPr>
                   <pic:blipFill>
-                    <a:blip r:embed="rId16"/>
+                    <a:blip r:embed="rId17"/>
                     <a:stretch>
                       <a:fillRect/>
                     </a:stretch>
@@ -22393,7 +22595,7 @@
         <w:drawing>
           <wp:inline xmlns:a="http://schemas.openxmlformats.org/drawingml/2006/main" xmlns:pic="http://schemas.openxmlformats.org/drawingml/2006/picture">
             <wp:extent cx="4389120" cy="4051495"/>
-            <wp:docPr id="6" name="Picture 6"/>
+            <wp:docPr id="7" name="Picture 7"/>
             <wp:cNvGraphicFramePr>
               <a:graphicFrameLocks noChangeAspect="1"/>
             </wp:cNvGraphicFramePr>
@@ -22405,7 +22607,7 @@
                     <pic:cNvPicPr/>
                   </pic:nvPicPr>
                   <pic:blipFill>
-                    <a:blip r:embed="rId17"/>
+                    <a:blip r:embed="rId18"/>
                     <a:stretch>
                       <a:fillRect/>
                     </a:stretch>
@@ -22460,7 +22662,7 @@
         <w:drawing>
           <wp:inline xmlns:a="http://schemas.openxmlformats.org/drawingml/2006/main" xmlns:pic="http://schemas.openxmlformats.org/drawingml/2006/picture">
             <wp:extent cx="4389120" cy="4051495"/>
-            <wp:docPr id="7" name="Picture 7"/>
+            <wp:docPr id="8" name="Picture 8"/>
             <wp:cNvGraphicFramePr>
               <a:graphicFrameLocks noChangeAspect="1"/>
             </wp:cNvGraphicFramePr>
@@ -22472,7 +22674,7 @@
                     <pic:cNvPicPr/>
                   </pic:nvPicPr>
                   <pic:blipFill>
-                    <a:blip r:embed="rId18"/>
+                    <a:blip r:embed="rId19"/>
                     <a:stretch>
                       <a:fillRect/>
                     </a:stretch>
@@ -24301,7 +24503,7 @@
         <w:drawing>
           <wp:inline xmlns:a="http://schemas.openxmlformats.org/drawingml/2006/main" xmlns:pic="http://schemas.openxmlformats.org/drawingml/2006/picture">
             <wp:extent cx="4389120" cy="3135086"/>
-            <wp:docPr id="8" name="Picture 8"/>
+            <wp:docPr id="9" name="Picture 9"/>
             <wp:cNvGraphicFramePr>
               <a:graphicFrameLocks noChangeAspect="1"/>
             </wp:cNvGraphicFramePr>
@@ -24313,7 +24515,7 @@
                     <pic:cNvPicPr/>
                   </pic:nvPicPr>
                   <pic:blipFill>
-                    <a:blip r:embed="rId19"/>
+                    <a:blip r:embed="rId20"/>
                     <a:stretch>
                       <a:fillRect/>
                     </a:stretch>
@@ -24368,7 +24570,7 @@
         <w:drawing>
           <wp:inline xmlns:a="http://schemas.openxmlformats.org/drawingml/2006/main" xmlns:pic="http://schemas.openxmlformats.org/drawingml/2006/picture">
             <wp:extent cx="5303520" cy="2946400"/>
-            <wp:docPr id="9" name="Picture 9"/>
+            <wp:docPr id="10" name="Picture 10"/>
             <wp:cNvGraphicFramePr>
               <a:graphicFrameLocks noChangeAspect="1"/>
             </wp:cNvGraphicFramePr>
@@ -24380,7 +24582,7 @@
                     <pic:cNvPicPr/>
                   </pic:nvPicPr>
                   <pic:blipFill>
-                    <a:blip r:embed="rId20"/>
+                    <a:blip r:embed="rId21"/>
                     <a:stretch>
                       <a:fillRect/>
                     </a:stretch>
@@ -26486,7 +26688,7 @@
         <w:drawing>
           <wp:inline xmlns:a="http://schemas.openxmlformats.org/drawingml/2006/main" xmlns:pic="http://schemas.openxmlformats.org/drawingml/2006/picture">
             <wp:extent cx="4754880" cy="3744468"/>
-            <wp:docPr id="10" name="Picture 10"/>
+            <wp:docPr id="11" name="Picture 11"/>
             <wp:cNvGraphicFramePr>
               <a:graphicFrameLocks noChangeAspect="1"/>
             </wp:cNvGraphicFramePr>
@@ -26498,7 +26700,7 @@
                     <pic:cNvPicPr/>
                   </pic:nvPicPr>
                   <pic:blipFill>
-                    <a:blip r:embed="rId21"/>
+                    <a:blip r:embed="rId22"/>
                     <a:stretch>
                       <a:fillRect/>
                     </a:stretch>
@@ -26540,7 +26742,7 @@
         <w:drawing>
           <wp:inline xmlns:a="http://schemas.openxmlformats.org/drawingml/2006/main" xmlns:pic="http://schemas.openxmlformats.org/drawingml/2006/picture">
             <wp:extent cx="4754880" cy="3744468"/>
-            <wp:docPr id="11" name="Picture 11"/>
+            <wp:docPr id="12" name="Picture 12"/>
             <wp:cNvGraphicFramePr>
               <a:graphicFrameLocks noChangeAspect="1"/>
             </wp:cNvGraphicFramePr>
@@ -26552,7 +26754,7 @@
                     <pic:cNvPicPr/>
                   </pic:nvPicPr>
                   <pic:blipFill>
-                    <a:blip r:embed="rId22"/>
+                    <a:blip r:embed="rId23"/>
                     <a:stretch>
                       <a:fillRect/>
                     </a:stretch>
@@ -26607,7 +26809,7 @@
         <w:drawing>
           <wp:inline xmlns:a="http://schemas.openxmlformats.org/drawingml/2006/main" xmlns:pic="http://schemas.openxmlformats.org/drawingml/2006/picture">
             <wp:extent cx="4389120" cy="3511296"/>
-            <wp:docPr id="12" name="Picture 12"/>
+            <wp:docPr id="13" name="Picture 13"/>
             <wp:cNvGraphicFramePr>
               <a:graphicFrameLocks noChangeAspect="1"/>
             </wp:cNvGraphicFramePr>
@@ -26619,7 +26821,7 @@
                     <pic:cNvPicPr/>
                   </pic:nvPicPr>
                   <pic:blipFill>
-                    <a:blip r:embed="rId23"/>
+                    <a:blip r:embed="rId24"/>
                     <a:stretch>
                       <a:fillRect/>
                     </a:stretch>
@@ -26741,7 +26943,7 @@
         <w:drawing>
           <wp:inline xmlns:a="http://schemas.openxmlformats.org/drawingml/2006/main" xmlns:pic="http://schemas.openxmlformats.org/drawingml/2006/picture">
             <wp:extent cx="5486400" cy="3862137"/>
-            <wp:docPr id="13" name="Picture 13"/>
+            <wp:docPr id="14" name="Picture 14"/>
             <wp:cNvGraphicFramePr>
               <a:graphicFrameLocks noChangeAspect="1"/>
             </wp:cNvGraphicFramePr>
@@ -26753,7 +26955,7 @@
                     <pic:cNvPicPr/>
                   </pic:nvPicPr>
                   <pic:blipFill>
-                    <a:blip r:embed="rId24"/>
+                    <a:blip r:embed="rId25"/>
                     <a:stretch>
                       <a:fillRect/>
                     </a:stretch>
@@ -27680,7 +27882,7 @@
       </w:r>
     </w:p>
     <w:sectPr>
-      <w:footerReference w:type="default" r:id="rId12"/>
+      <w:footerReference w:type="default" r:id="rId13"/>
       <w:pgSz w:w="12240" w:h="15840"/>
       <w:pgMar w:top="1440" w:right="1080" w:bottom="720" w:left="1440" w:header="720" w:footer="720" w:gutter="0"/>
       <w:cols w:space="720"/>

</xml_diff>